<commit_message>
Add CES elasticity project with analysis script, outputs and README
</commit_message>
<xml_diff>
--- a/us_macro_analysis/docs/methodology/US_MonetaryPolicy_Business_Cycle_Dynamics_Project_Methodology.docx
+++ b/us_macro_analysis/docs/methodology/US_MonetaryPolicy_Business_Cycle_Dynamics_Project_Methodology.docx
@@ -7433,6 +7433,26 @@
     </w:p>
     <w:p>
       <w:pPr>
+        <w:spacing w:after="0"/>
+        <w:rPr>
+          <w:rFonts w:ascii="Calibri" w:hAnsi="Calibri" w:cs="Calibri"/>
+          <w:sz w:val="21"/>
+          <w:szCs w:val="21"/>
+        </w:rPr>
+      </w:pPr>
+    </w:p>
+    <w:p>
+      <w:pPr>
+        <w:spacing w:after="0"/>
+        <w:rPr>
+          <w:rFonts w:ascii="Calibri" w:hAnsi="Calibri" w:cs="Calibri"/>
+          <w:sz w:val="21"/>
+          <w:szCs w:val="21"/>
+        </w:rPr>
+      </w:pPr>
+    </w:p>
+    <w:p>
+      <w:pPr>
         <w:pStyle w:val="Heading1"/>
         <w:spacing w:before="0"/>
         <w:rPr>
@@ -7443,6 +7463,7 @@
         <w:rPr>
           <w:rFonts w:ascii="Calibri" w:hAnsi="Calibri" w:cs="Calibri"/>
         </w:rPr>
+        <w:lastRenderedPageBreak/>
         <w:t>6</w:t>
       </w:r>
       <w:r>
@@ -7495,6 +7516,16 @@
           <w:szCs w:val="21"/>
         </w:rPr>
       </w:pPr>
+    </w:p>
+    <w:p>
+      <w:pPr>
+        <w:spacing w:after="0"/>
+        <w:rPr>
+          <w:rFonts w:ascii="Calibri" w:hAnsi="Calibri" w:cs="Calibri"/>
+          <w:sz w:val="21"/>
+          <w:szCs w:val="21"/>
+        </w:rPr>
+      </w:pPr>
       <w:r>
         <w:rPr>
           <w:rFonts w:ascii="Calibri" w:hAnsi="Calibri" w:cs="Calibri"/>
@@ -7519,7 +7550,6 @@
           <w:sz w:val="21"/>
           <w:szCs w:val="21"/>
         </w:rPr>
-        <w:lastRenderedPageBreak/>
         <w:t>π_be(t,n) ≈ i_nominal(t,n) − i_real(t,n)</w:t>
       </w:r>
       <w:r>
@@ -7954,6 +7984,7 @@
           <w:sz w:val="21"/>
           <w:szCs w:val="21"/>
         </w:rPr>
+        <w:lastRenderedPageBreak/>
         <w:t>• Fed targets a market rate; ECB controls administered rates more directly</w:t>
       </w:r>
       <w:r>
@@ -8008,7 +8039,6 @@
           <w:sz w:val="21"/>
           <w:szCs w:val="21"/>
         </w:rPr>
-        <w:lastRenderedPageBreak/>
         <w:t>Policy Interpretation:</w:t>
       </w:r>
       <w:r>

</xml_diff>

<commit_message>
us macro analysis project - review README and methodology
</commit_message>
<xml_diff>
--- a/us_macro_analysis/docs/methodology/US_MonetaryPolicy_Business_Cycle_Dynamics_Project_Methodology.docx
+++ b/us_macro_analysis/docs/methodology/US_MonetaryPolicy_Business_Cycle_Dynamics_Project_Methodology.docx
@@ -1191,34 +1191,6 @@
           <w:szCs w:val="21"/>
         </w:rPr>
       </w:pPr>
-    </w:p>
-    <w:p>
-      <w:pPr>
-        <w:spacing w:after="0"/>
-        <w:rPr>
-          <w:rFonts w:ascii="Calibri" w:hAnsi="Calibri" w:cs="Calibri"/>
-          <w:sz w:val="21"/>
-          <w:szCs w:val="21"/>
-        </w:rPr>
-      </w:pPr>
-      <w:r>
-        <w:rPr>
-          <w:rFonts w:ascii="Calibri" w:hAnsi="Calibri" w:cs="Calibri"/>
-          <w:sz w:val="21"/>
-          <w:szCs w:val="21"/>
-        </w:rPr>
-        <w:t>The Taylor Rule is estimated using both headline and core inflation to assess whether monetary policy reacts more strongly to transitory or persistent inflation components.</w:t>
-      </w:r>
-    </w:p>
-    <w:p>
-      <w:pPr>
-        <w:spacing w:after="0"/>
-        <w:rPr>
-          <w:rFonts w:ascii="Calibri" w:hAnsi="Calibri" w:cs="Calibri"/>
-          <w:sz w:val="21"/>
-          <w:szCs w:val="21"/>
-        </w:rPr>
-      </w:pPr>
       <w:r>
         <w:rPr>
           <w:rFonts w:ascii="Calibri" w:hAnsi="Calibri" w:cs="Calibri"/>
@@ -1764,12 +1736,56 @@
         <w:spacing w:after="0"/>
         <w:rPr>
           <w:rFonts w:ascii="Calibri" w:hAnsi="Calibri" w:cs="Calibri"/>
+          <w:sz w:val="21"/>
+          <w:szCs w:val="21"/>
+        </w:rPr>
+      </w:pPr>
+      <w:r>
+        <w:rPr>
+          <w:rFonts w:ascii="Calibri" w:hAnsi="Calibri" w:cs="Calibri"/>
           <w:b/>
           <w:bCs/>
           <w:sz w:val="21"/>
           <w:szCs w:val="21"/>
         </w:rPr>
-      </w:pPr>
+        <w:t>Beveridge</w:t>
+      </w:r>
+      <w:r>
+        <w:rPr>
+          <w:rFonts w:ascii="Calibri" w:hAnsi="Calibri" w:cs="Calibri"/>
+          <w:b/>
+          <w:bCs/>
+          <w:sz w:val="21"/>
+          <w:szCs w:val="21"/>
+        </w:rPr>
+        <w:t>’s Curve</w:t>
+      </w:r>
+      <w:r>
+        <w:rPr>
+          <w:rFonts w:ascii="Calibri" w:hAnsi="Calibri" w:cs="Calibri"/>
+          <w:b/>
+          <w:bCs/>
+          <w:sz w:val="21"/>
+          <w:szCs w:val="21"/>
+        </w:rPr>
+        <w:t>:</w:t>
+      </w:r>
+      <w:r>
+        <w:rPr>
+          <w:rFonts w:ascii="Calibri" w:hAnsi="Calibri" w:cs="Calibri"/>
+          <w:sz w:val="21"/>
+          <w:szCs w:val="21"/>
+        </w:rPr>
+        <w:br/>
+      </w:r>
+      <w:r>
+        <w:rPr>
+          <w:rFonts w:ascii="Calibri" w:hAnsi="Calibri" w:cs="Calibri"/>
+          <w:sz w:val="21"/>
+          <w:szCs w:val="21"/>
+        </w:rPr>
+        <w:t>u_t = α − b v_t + ε_t</w:t>
+      </w:r>
     </w:p>
     <w:p>
       <w:pPr>
@@ -1783,14 +1799,67 @@
       <w:r>
         <w:rPr>
           <w:rFonts w:ascii="Calibri" w:hAnsi="Calibri" w:cs="Calibri"/>
+          <w:sz w:val="21"/>
+          <w:szCs w:val="21"/>
+        </w:rPr>
+        <w:t>v_t = JTSJOR (vacancy rate</w:t>
+      </w:r>
+      <w:r>
+        <w:rPr>
+          <w:rFonts w:ascii="Calibri" w:hAnsi="Calibri" w:cs="Calibri"/>
+          <w:sz w:val="21"/>
+          <w:szCs w:val="21"/>
+        </w:rPr>
+        <w:t xml:space="preserve"> proxy</w:t>
+      </w:r>
+      <w:r>
+        <w:rPr>
+          <w:rFonts w:ascii="Calibri" w:hAnsi="Calibri" w:cs="Calibri"/>
+          <w:sz w:val="21"/>
+          <w:szCs w:val="21"/>
+        </w:rPr>
+        <w:t>)</w:t>
+      </w:r>
+    </w:p>
+    <w:p>
+      <w:pPr>
+        <w:spacing w:after="0"/>
+        <w:rPr>
+          <w:rFonts w:ascii="Calibri" w:hAnsi="Calibri" w:cs="Calibri"/>
+          <w:sz w:val="21"/>
+          <w:szCs w:val="21"/>
+        </w:rPr>
+      </w:pPr>
+      <w:r>
+        <w:rPr>
+          <w:rFonts w:ascii="Calibri" w:hAnsi="Calibri" w:cs="Calibri"/>
+          <w:sz w:val="21"/>
+          <w:szCs w:val="21"/>
+        </w:rPr>
+        <w:t>The relationship is estimated linearly, while a quadratic fit is used for visualization purposes.</w:t>
+      </w:r>
+    </w:p>
+    <w:p>
+      <w:pPr>
+        <w:spacing w:after="0"/>
+        <w:rPr>
+          <w:rFonts w:ascii="Calibri" w:hAnsi="Calibri" w:cs="Calibri"/>
+          <w:sz w:val="21"/>
+          <w:szCs w:val="21"/>
+        </w:rPr>
+      </w:pPr>
+    </w:p>
+    <w:p>
+      <w:pPr>
+        <w:spacing w:after="0"/>
+        <w:rPr>
+          <w:rFonts w:ascii="Calibri" w:hAnsi="Calibri" w:cs="Calibri"/>
           <w:b/>
           <w:bCs/>
           <w:sz w:val="21"/>
           <w:szCs w:val="21"/>
         </w:rPr>
-        <w:lastRenderedPageBreak/>
-        <w:t>Beveridge</w:t>
-      </w:r>
+      </w:pPr>
       <w:r>
         <w:rPr>
           <w:rFonts w:ascii="Calibri" w:hAnsi="Calibri" w:cs="Calibri"/>
@@ -1799,7 +1868,8 @@
           <w:sz w:val="21"/>
           <w:szCs w:val="21"/>
         </w:rPr>
-        <w:t>’s Curve</w:t>
+        <w:lastRenderedPageBreak/>
+        <w:t>Sahm</w:t>
       </w:r>
       <w:r>
         <w:rPr>
@@ -1809,23 +1879,17 @@
           <w:sz w:val="21"/>
           <w:szCs w:val="21"/>
         </w:rPr>
-        <w:t>:</w:t>
-      </w:r>
-      <w:r>
-        <w:rPr>
-          <w:rFonts w:ascii="Calibri" w:hAnsi="Calibri" w:cs="Calibri"/>
-          <w:sz w:val="21"/>
-          <w:szCs w:val="21"/>
-        </w:rPr>
-        <w:br/>
-      </w:r>
-      <w:r>
-        <w:rPr>
-          <w:rFonts w:ascii="Calibri" w:hAnsi="Calibri" w:cs="Calibri"/>
-          <w:sz w:val="21"/>
-          <w:szCs w:val="21"/>
-        </w:rPr>
-        <w:t>u_t = α − b v_t + ε_t</w:t>
+        <w:t xml:space="preserve">’s </w:t>
+      </w:r>
+      <w:r>
+        <w:rPr>
+          <w:rFonts w:ascii="Calibri" w:hAnsi="Calibri" w:cs="Calibri"/>
+          <w:b/>
+          <w:bCs/>
+          <w:sz w:val="21"/>
+          <w:szCs w:val="21"/>
+        </w:rPr>
+        <w:t xml:space="preserve">Rule: </w:t>
       </w:r>
     </w:p>
     <w:p>
@@ -1843,23 +1907,16 @@
           <w:sz w:val="21"/>
           <w:szCs w:val="21"/>
         </w:rPr>
-        <w:t>v_t = JTSJOR (vacancy rate</w:t>
-      </w:r>
-      <w:r>
-        <w:rPr>
-          <w:rFonts w:ascii="Calibri" w:hAnsi="Calibri" w:cs="Calibri"/>
-          <w:sz w:val="21"/>
-          <w:szCs w:val="21"/>
-        </w:rPr>
-        <w:t xml:space="preserve"> proxy</w:t>
-      </w:r>
-      <w:r>
-        <w:rPr>
-          <w:rFonts w:ascii="Calibri" w:hAnsi="Calibri" w:cs="Calibri"/>
-          <w:sz w:val="21"/>
-          <w:szCs w:val="21"/>
-        </w:rPr>
-        <w:t>)</w:t>
+        <w:t>3-month moving average of unemployment minus minimum over previous 12 months.</w:t>
+      </w:r>
+      <w:r>
+        <w:rPr>
+          <w:rFonts w:ascii="Calibri" w:hAnsi="Calibri" w:cs="Calibri"/>
+          <w:sz w:val="21"/>
+          <w:szCs w:val="21"/>
+        </w:rPr>
+        <w:br/>
+        <w:t>Recession signal if ≥ 0.5 percentage points.</w:t>
       </w:r>
     </w:p>
     <w:p>
@@ -1871,74 +1928,38 @@
           <w:szCs w:val="21"/>
         </w:rPr>
       </w:pPr>
+      <w:r>
+        <w:rPr>
+          <w:rFonts w:ascii="Calibri" w:hAnsi="Calibri" w:cs="Calibri"/>
+          <w:sz w:val="21"/>
+          <w:szCs w:val="21"/>
+        </w:rPr>
+        <w:t>The minimum is computed over a rolling 12-month window.</w:t>
+      </w:r>
     </w:p>
     <w:p>
       <w:pPr>
         <w:spacing w:after="0"/>
         <w:rPr>
           <w:rFonts w:ascii="Calibri" w:hAnsi="Calibri" w:cs="Calibri"/>
-          <w:b/>
-          <w:bCs/>
-          <w:sz w:val="21"/>
-          <w:szCs w:val="21"/>
-        </w:rPr>
-      </w:pPr>
-      <w:r>
-        <w:rPr>
-          <w:rFonts w:ascii="Calibri" w:hAnsi="Calibri" w:cs="Calibri"/>
-          <w:b/>
-          <w:bCs/>
-          <w:sz w:val="21"/>
-          <w:szCs w:val="21"/>
-        </w:rPr>
-        <w:t>Sahm</w:t>
-      </w:r>
-      <w:r>
-        <w:rPr>
-          <w:rFonts w:ascii="Calibri" w:hAnsi="Calibri" w:cs="Calibri"/>
-          <w:b/>
-          <w:bCs/>
-          <w:sz w:val="21"/>
-          <w:szCs w:val="21"/>
-        </w:rPr>
-        <w:t xml:space="preserve">’s </w:t>
-      </w:r>
-      <w:r>
-        <w:rPr>
-          <w:rFonts w:ascii="Calibri" w:hAnsi="Calibri" w:cs="Calibri"/>
-          <w:b/>
-          <w:bCs/>
-          <w:sz w:val="21"/>
-          <w:szCs w:val="21"/>
-        </w:rPr>
-        <w:t xml:space="preserve">Rule: </w:t>
-      </w:r>
+          <w:sz w:val="21"/>
+          <w:szCs w:val="21"/>
+        </w:rPr>
+      </w:pPr>
     </w:p>
     <w:p>
       <w:pPr>
-        <w:spacing w:after="0"/>
-        <w:rPr>
-          <w:rFonts w:ascii="Calibri" w:hAnsi="Calibri" w:cs="Calibri"/>
-          <w:sz w:val="21"/>
-          <w:szCs w:val="21"/>
-        </w:rPr>
-      </w:pPr>
-      <w:r>
-        <w:rPr>
-          <w:rFonts w:ascii="Calibri" w:hAnsi="Calibri" w:cs="Calibri"/>
-          <w:sz w:val="21"/>
-          <w:szCs w:val="21"/>
-        </w:rPr>
-        <w:t>3-month moving average of unemployment minus minimum over previous 12 months.</w:t>
-      </w:r>
-      <w:r>
-        <w:rPr>
-          <w:rFonts w:ascii="Calibri" w:hAnsi="Calibri" w:cs="Calibri"/>
-          <w:sz w:val="21"/>
-          <w:szCs w:val="21"/>
-        </w:rPr>
-        <w:br/>
-        <w:t>Recession signal if ≥ 0.5 percentage points.</w:t>
+        <w:pStyle w:val="Heading1"/>
+        <w:spacing w:before="0"/>
+        <w:rPr>
+          <w:rFonts w:ascii="Calibri" w:hAnsi="Calibri" w:cs="Calibri"/>
+        </w:rPr>
+      </w:pPr>
+      <w:r>
+        <w:rPr>
+          <w:rFonts w:ascii="Calibri" w:hAnsi="Calibri" w:cs="Calibri"/>
+        </w:rPr>
+        <w:t>4. Important Note on Relationships</w:t>
       </w:r>
     </w:p>
     <w:p>
@@ -1950,9 +1971,182 @@
           <w:szCs w:val="21"/>
         </w:rPr>
       </w:pPr>
+      <w:r>
+        <w:rPr>
+          <w:rFonts w:ascii="Calibri" w:hAnsi="Calibri" w:cs="Calibri"/>
+          <w:sz w:val="21"/>
+          <w:szCs w:val="21"/>
+        </w:rPr>
+        <w:t>The Python implementation distinguishes between regression-based macro relationships (Phillips Curve, Okun’s Law in levels and differences, Beveridge Curve) and indicator/benchmark-based frameworks (Sahm Rule, Taylor Rule). The Phillips Curve is estimated as a multiple regression, while Taylor’s Rule is implemented as an implied benchmark policy rate under four alternative specifications: output gap vs unemployment gap, and core vs headline PCE inflation.</w:t>
+      </w:r>
     </w:p>
     <w:p>
       <w:pPr>
+        <w:spacing w:after="0"/>
+        <w:rPr>
+          <w:rFonts w:ascii="Calibri" w:hAnsi="Calibri" w:cs="Calibri"/>
+          <w:sz w:val="21"/>
+          <w:szCs w:val="21"/>
+        </w:rPr>
+      </w:pPr>
+      <w:r>
+        <w:rPr>
+          <w:rFonts w:ascii="Calibri" w:hAnsi="Calibri" w:cs="Calibri"/>
+          <w:sz w:val="21"/>
+          <w:szCs w:val="21"/>
+        </w:rPr>
+        <w:t xml:space="preserve">The </w:t>
+      </w:r>
+      <w:r>
+        <w:rPr>
+          <w:rFonts w:ascii="Calibri" w:hAnsi="Calibri" w:cs="Calibri"/>
+          <w:sz w:val="21"/>
+          <w:szCs w:val="21"/>
+        </w:rPr>
+        <w:t>Okun</w:t>
+      </w:r>
+      <w:r>
+        <w:rPr>
+          <w:rFonts w:ascii="Calibri" w:hAnsi="Calibri" w:cs="Calibri"/>
+          <w:sz w:val="21"/>
+          <w:szCs w:val="21"/>
+        </w:rPr>
+        <w:t>’s Law</w:t>
+      </w:r>
+      <w:r>
+        <w:rPr>
+          <w:rFonts w:ascii="Calibri" w:hAnsi="Calibri" w:cs="Calibri"/>
+          <w:sz w:val="21"/>
+          <w:szCs w:val="21"/>
+        </w:rPr>
+        <w:t xml:space="preserve"> (levels) uses stock variables (gaps), while Okun</w:t>
+      </w:r>
+      <w:r>
+        <w:rPr>
+          <w:rFonts w:ascii="Calibri" w:hAnsi="Calibri" w:cs="Calibri"/>
+          <w:sz w:val="21"/>
+          <w:szCs w:val="21"/>
+        </w:rPr>
+        <w:t>’s Law</w:t>
+      </w:r>
+      <w:r>
+        <w:rPr>
+          <w:rFonts w:ascii="Calibri" w:hAnsi="Calibri" w:cs="Calibri"/>
+          <w:sz w:val="21"/>
+          <w:szCs w:val="21"/>
+        </w:rPr>
+        <w:t xml:space="preserve"> (difference) uses flow variables (changes).</w:t>
+      </w:r>
+    </w:p>
+    <w:p>
+      <w:pPr>
+        <w:spacing w:after="0"/>
+        <w:rPr>
+          <w:rFonts w:ascii="Calibri" w:hAnsi="Calibri" w:cs="Calibri"/>
+          <w:sz w:val="21"/>
+          <w:szCs w:val="21"/>
+        </w:rPr>
+      </w:pPr>
+      <w:r>
+        <w:rPr>
+          <w:rFonts w:ascii="Calibri" w:hAnsi="Calibri" w:cs="Calibri"/>
+          <w:sz w:val="21"/>
+          <w:szCs w:val="21"/>
+        </w:rPr>
+        <w:t>Beyond the standard Beveridge curve (Unemployment Rate vs Job Openings Rate), the analysis can be extended by computing a labour market tightness indicator. This is defined as the ratio between job openings and unemployment.</w:t>
+      </w:r>
+    </w:p>
+    <w:p>
+      <w:pPr>
+        <w:spacing w:after="0"/>
+        <w:rPr>
+          <w:rFonts w:ascii="Calibri" w:hAnsi="Calibri" w:cs="Calibri"/>
+          <w:sz w:val="21"/>
+          <w:szCs w:val="21"/>
+        </w:rPr>
+      </w:pPr>
+      <w:r>
+        <w:rPr>
+          <w:rFonts w:ascii="Calibri" w:hAnsi="Calibri" w:cs="Calibri"/>
+          <w:sz w:val="21"/>
+          <w:szCs w:val="21"/>
+        </w:rPr>
+        <w:t>Tightness formula:</w:t>
+      </w:r>
+      <w:r>
+        <w:rPr>
+          <w:rFonts w:ascii="Calibri" w:hAnsi="Calibri" w:cs="Calibri"/>
+          <w:sz w:val="21"/>
+          <w:szCs w:val="21"/>
+        </w:rPr>
+        <w:t xml:space="preserve"> </w:t>
+      </w:r>
+      <w:r>
+        <w:rPr>
+          <w:rFonts w:ascii="Calibri" w:hAnsi="Calibri" w:cs="Calibri"/>
+          <w:sz w:val="21"/>
+          <w:szCs w:val="21"/>
+        </w:rPr>
+        <w:t>Tightness_t = JOB_OPENINGS_RATE_t / UNRATE_t</w:t>
+      </w:r>
+    </w:p>
+    <w:p>
+      <w:pPr>
+        <w:spacing w:after="0"/>
+        <w:rPr>
+          <w:rFonts w:ascii="Calibri" w:hAnsi="Calibri" w:cs="Calibri"/>
+          <w:sz w:val="21"/>
+          <w:szCs w:val="21"/>
+        </w:rPr>
+      </w:pPr>
+      <w:r>
+        <w:rPr>
+          <w:rFonts w:ascii="Calibri" w:hAnsi="Calibri" w:cs="Calibri"/>
+          <w:sz w:val="21"/>
+          <w:szCs w:val="21"/>
+        </w:rPr>
+        <w:t>Interpretation:</w:t>
+      </w:r>
+      <w:r>
+        <w:rPr>
+          <w:rFonts w:ascii="Calibri" w:hAnsi="Calibri" w:cs="Calibri"/>
+          <w:sz w:val="21"/>
+          <w:szCs w:val="21"/>
+        </w:rPr>
+        <w:br/>
+        <w:t>• Higher tightness = more vacancies relative to unemployment, indicating a tighter labour market.</w:t>
+      </w:r>
+      <w:r>
+        <w:rPr>
+          <w:rFonts w:ascii="Calibri" w:hAnsi="Calibri" w:cs="Calibri"/>
+          <w:sz w:val="21"/>
+          <w:szCs w:val="21"/>
+        </w:rPr>
+        <w:br/>
+        <w:t>• Lower tightness = weaker labour demand relative to labour supply.</w:t>
+      </w:r>
+      <w:r>
+        <w:rPr>
+          <w:rFonts w:ascii="Calibri" w:hAnsi="Calibri" w:cs="Calibri"/>
+          <w:sz w:val="21"/>
+          <w:szCs w:val="21"/>
+        </w:rPr>
+        <w:br/>
+        <w:t>• Tightness complements, but does not replace, the Beveridge curve.</w:t>
+      </w:r>
+    </w:p>
+    <w:p>
+      <w:pPr>
+        <w:spacing w:after="0"/>
+        <w:rPr>
+          <w:rFonts w:ascii="Calibri" w:hAnsi="Calibri" w:cs="Calibri"/>
+          <w:sz w:val="21"/>
+          <w:szCs w:val="21"/>
+        </w:rPr>
+      </w:pPr>
+    </w:p>
+    <w:p>
+      <w:pPr>
         <w:pStyle w:val="Heading1"/>
         <w:spacing w:before="0"/>
         <w:rPr>
@@ -1963,7 +2157,13 @@
         <w:rPr>
           <w:rFonts w:ascii="Calibri" w:hAnsi="Calibri" w:cs="Calibri"/>
         </w:rPr>
-        <w:t>4. Important Note on Relationships</w:t>
+        <w:t>6</w:t>
+      </w:r>
+      <w:r>
+        <w:rPr>
+          <w:rFonts w:ascii="Calibri" w:hAnsi="Calibri" w:cs="Calibri"/>
+        </w:rPr>
+        <w:t>. Inflation Expectations: 5Y5Y Forward and Breakeven</w:t>
       </w:r>
     </w:p>
     <w:p>
@@ -1981,7 +2181,23 @@
           <w:sz w:val="21"/>
           <w:szCs w:val="21"/>
         </w:rPr>
-        <w:t>The Python implementation distinguishes between regression-based macro relationships (Phillips Curve, Okun’s Law in levels and differences, Beveridge Curve) and indicator/benchmark-based frameworks (Sahm Rule, Taylor Rule). The Phillips Curve is estimated as a multiple regression, while Taylor’s Rule is implemented as an implied benchmark policy rate under four alternative specifications: output gap vs unemployment gap, and core vs headline PCE inflation.</w:t>
+        <w:t>The project uses market-based inflation expectations derived from financial instruments. Two key measures are considered: the 5-year, 5-year forward inflation rate (5Y5Y)</w:t>
+      </w:r>
+      <w:r>
+        <w:rPr>
+          <w:rFonts w:ascii="Calibri" w:hAnsi="Calibri" w:cs="Calibri"/>
+          <w:sz w:val="21"/>
+          <w:szCs w:val="21"/>
+        </w:rPr>
+        <w:t>,</w:t>
+      </w:r>
+      <w:r>
+        <w:rPr>
+          <w:rFonts w:ascii="Calibri" w:hAnsi="Calibri" w:cs="Calibri"/>
+          <w:sz w:val="21"/>
+          <w:szCs w:val="21"/>
+        </w:rPr>
+        <w:t xml:space="preserve"> and breakeven inflation rates derived from nominal and inflation-indexed bonds.</w:t>
       </w:r>
     </w:p>
     <w:p>
@@ -1993,54 +2209,6 @@
           <w:szCs w:val="21"/>
         </w:rPr>
       </w:pPr>
-      <w:r>
-        <w:rPr>
-          <w:rFonts w:ascii="Calibri" w:hAnsi="Calibri" w:cs="Calibri"/>
-          <w:sz w:val="21"/>
-          <w:szCs w:val="21"/>
-        </w:rPr>
-        <w:t xml:space="preserve">The </w:t>
-      </w:r>
-      <w:r>
-        <w:rPr>
-          <w:rFonts w:ascii="Calibri" w:hAnsi="Calibri" w:cs="Calibri"/>
-          <w:sz w:val="21"/>
-          <w:szCs w:val="21"/>
-        </w:rPr>
-        <w:t>Okun</w:t>
-      </w:r>
-      <w:r>
-        <w:rPr>
-          <w:rFonts w:ascii="Calibri" w:hAnsi="Calibri" w:cs="Calibri"/>
-          <w:sz w:val="21"/>
-          <w:szCs w:val="21"/>
-        </w:rPr>
-        <w:t>’s Law</w:t>
-      </w:r>
-      <w:r>
-        <w:rPr>
-          <w:rFonts w:ascii="Calibri" w:hAnsi="Calibri" w:cs="Calibri"/>
-          <w:sz w:val="21"/>
-          <w:szCs w:val="21"/>
-        </w:rPr>
-        <w:t xml:space="preserve"> (levels) uses stock variables (gaps), while Okun</w:t>
-      </w:r>
-      <w:r>
-        <w:rPr>
-          <w:rFonts w:ascii="Calibri" w:hAnsi="Calibri" w:cs="Calibri"/>
-          <w:sz w:val="21"/>
-          <w:szCs w:val="21"/>
-        </w:rPr>
-        <w:t>’s Law</w:t>
-      </w:r>
-      <w:r>
-        <w:rPr>
-          <w:rFonts w:ascii="Calibri" w:hAnsi="Calibri" w:cs="Calibri"/>
-          <w:sz w:val="21"/>
-          <w:szCs w:val="21"/>
-        </w:rPr>
-        <w:t xml:space="preserve"> (difference) uses flow variables (changes).</w:t>
-      </w:r>
     </w:p>
     <w:p>
       <w:pPr>
@@ -2057,7 +2225,7 @@
           <w:sz w:val="21"/>
           <w:szCs w:val="21"/>
         </w:rPr>
-        <w:t>Beyond the standard Beveridge curve (Unemployment Rate vs Job Openings Rate), the analysis can be extended by computing a labour market tightness indicator. This is defined as the ratio between job openings and unemployment.</w:t>
+        <w:t>Breakeven inflation (spot):</w:t>
       </w:r>
     </w:p>
     <w:p>
@@ -2075,23 +2243,16 @@
           <w:sz w:val="21"/>
           <w:szCs w:val="21"/>
         </w:rPr>
-        <w:t>Tightness formula:</w:t>
-      </w:r>
-      <w:r>
-        <w:rPr>
-          <w:rFonts w:ascii="Calibri" w:hAnsi="Calibri" w:cs="Calibri"/>
-          <w:sz w:val="21"/>
-          <w:szCs w:val="21"/>
-        </w:rPr>
-        <w:t xml:space="preserve"> </w:t>
-      </w:r>
-      <w:r>
-        <w:rPr>
-          <w:rFonts w:ascii="Calibri" w:hAnsi="Calibri" w:cs="Calibri"/>
-          <w:sz w:val="21"/>
-          <w:szCs w:val="21"/>
-        </w:rPr>
-        <w:t>Tightness_t = JOB_OPENINGS_RATE_t / UNRATE_t</w:t>
+        <w:t>π_be(t,n) ≈ i_nominal(t,n) − i_real(t,n)</w:t>
+      </w:r>
+      <w:r>
+        <w:rPr>
+          <w:rFonts w:ascii="Calibri" w:hAnsi="Calibri" w:cs="Calibri"/>
+          <w:sz w:val="21"/>
+          <w:szCs w:val="21"/>
+        </w:rPr>
+        <w:br/>
+        <w:t>Example: 10-year breakeven = T10YIE</w:t>
       </w:r>
     </w:p>
     <w:p>
@@ -2103,41 +2264,6 @@
           <w:szCs w:val="21"/>
         </w:rPr>
       </w:pPr>
-      <w:r>
-        <w:rPr>
-          <w:rFonts w:ascii="Calibri" w:hAnsi="Calibri" w:cs="Calibri"/>
-          <w:sz w:val="21"/>
-          <w:szCs w:val="21"/>
-        </w:rPr>
-        <w:t>Interpretation:</w:t>
-      </w:r>
-      <w:r>
-        <w:rPr>
-          <w:rFonts w:ascii="Calibri" w:hAnsi="Calibri" w:cs="Calibri"/>
-          <w:sz w:val="21"/>
-          <w:szCs w:val="21"/>
-        </w:rPr>
-        <w:br/>
-        <w:t>• Higher tightness = more vacancies relative to unemployment, indicating a tighter labour market.</w:t>
-      </w:r>
-      <w:r>
-        <w:rPr>
-          <w:rFonts w:ascii="Calibri" w:hAnsi="Calibri" w:cs="Calibri"/>
-          <w:sz w:val="21"/>
-          <w:szCs w:val="21"/>
-        </w:rPr>
-        <w:br/>
-        <w:t>• Lower tightness = weaker labour demand relative to labour supply.</w:t>
-      </w:r>
-      <w:r>
-        <w:rPr>
-          <w:rFonts w:ascii="Calibri" w:hAnsi="Calibri" w:cs="Calibri"/>
-          <w:sz w:val="21"/>
-          <w:szCs w:val="21"/>
-        </w:rPr>
-        <w:br/>
-        <w:t>• Tightness complements, but does not replace, the Beveridge curve.</w:t>
-      </w:r>
     </w:p>
     <w:p>
       <w:pPr>
@@ -2148,9 +2274,175 @@
           <w:szCs w:val="21"/>
         </w:rPr>
       </w:pPr>
+      <w:r>
+        <w:rPr>
+          <w:rFonts w:ascii="Calibri" w:hAnsi="Calibri" w:cs="Calibri"/>
+          <w:sz w:val="21"/>
+          <w:szCs w:val="21"/>
+        </w:rPr>
+        <w:t>5Y5Y Forward inflation:</w:t>
+      </w:r>
     </w:p>
     <w:p>
       <w:pPr>
+        <w:spacing w:after="0"/>
+        <w:rPr>
+          <w:rFonts w:ascii="Calibri" w:hAnsi="Calibri" w:cs="Calibri"/>
+          <w:sz w:val="21"/>
+          <w:szCs w:val="21"/>
+        </w:rPr>
+      </w:pPr>
+      <w:r>
+        <w:rPr>
+          <w:rFonts w:ascii="Calibri" w:hAnsi="Calibri" w:cs="Calibri"/>
+          <w:sz w:val="21"/>
+          <w:szCs w:val="21"/>
+        </w:rPr>
+        <w:t>The 5Y5Y forward rate reflects expected inflation over a 5-year period starting 5 years ahead.</w:t>
+      </w:r>
+    </w:p>
+    <w:p>
+      <w:pPr>
+        <w:spacing w:after="0"/>
+        <w:rPr>
+          <w:rFonts w:ascii="Calibri" w:hAnsi="Calibri" w:cs="Calibri"/>
+          <w:sz w:val="21"/>
+          <w:szCs w:val="21"/>
+        </w:rPr>
+      </w:pPr>
+      <w:r>
+        <w:rPr>
+          <w:rFonts w:ascii="Calibri" w:hAnsi="Calibri" w:cs="Calibri"/>
+          <w:sz w:val="21"/>
+          <w:szCs w:val="21"/>
+        </w:rPr>
+        <w:br/>
+        <w:t>It is derived from spot rates using no-arbitrage conditions:</w:t>
+      </w:r>
+    </w:p>
+    <w:p>
+      <w:pPr>
+        <w:spacing w:after="0"/>
+        <w:rPr>
+          <w:rFonts w:ascii="Calibri" w:hAnsi="Calibri" w:cs="Calibri"/>
+          <w:sz w:val="21"/>
+          <w:szCs w:val="21"/>
+        </w:rPr>
+      </w:pPr>
+      <w:r>
+        <w:rPr>
+          <w:rFonts w:ascii="Calibri" w:hAnsi="Calibri" w:cs="Calibri"/>
+          <w:sz w:val="21"/>
+          <w:szCs w:val="21"/>
+        </w:rPr>
+        <w:t>(1 + i_10)^10 = (1 + i_5)^5 * (1 + f_5y5y)^5</w:t>
+      </w:r>
+    </w:p>
+    <w:p>
+      <w:pPr>
+        <w:spacing w:after="0"/>
+        <w:rPr>
+          <w:rFonts w:ascii="Calibri" w:hAnsi="Calibri" w:cs="Calibri"/>
+          <w:sz w:val="21"/>
+          <w:szCs w:val="21"/>
+        </w:rPr>
+      </w:pPr>
+    </w:p>
+    <w:p>
+      <w:pPr>
+        <w:spacing w:after="0"/>
+        <w:rPr>
+          <w:rFonts w:ascii="Calibri" w:hAnsi="Calibri" w:cs="Calibri"/>
+          <w:sz w:val="21"/>
+          <w:szCs w:val="21"/>
+        </w:rPr>
+      </w:pPr>
+      <w:r>
+        <w:rPr>
+          <w:rFonts w:ascii="Calibri" w:hAnsi="Calibri" w:cs="Calibri"/>
+          <w:sz w:val="21"/>
+          <w:szCs w:val="21"/>
+        </w:rPr>
+        <w:t>Approximation:</w:t>
+      </w:r>
+      <w:r>
+        <w:rPr>
+          <w:rFonts w:ascii="Calibri" w:hAnsi="Calibri" w:cs="Calibri"/>
+          <w:sz w:val="21"/>
+          <w:szCs w:val="21"/>
+        </w:rPr>
+        <w:br/>
+        <w:t xml:space="preserve"> f_5y5y ≈ 2*i_10 − i_5</w:t>
+      </w:r>
+    </w:p>
+    <w:p>
+      <w:pPr>
+        <w:spacing w:after="0"/>
+        <w:rPr>
+          <w:rFonts w:ascii="Calibri" w:hAnsi="Calibri" w:cs="Calibri"/>
+          <w:sz w:val="21"/>
+          <w:szCs w:val="21"/>
+        </w:rPr>
+      </w:pPr>
+      <w:r>
+        <w:rPr>
+          <w:rFonts w:ascii="Calibri" w:hAnsi="Calibri" w:cs="Calibri"/>
+          <w:sz w:val="21"/>
+          <w:szCs w:val="21"/>
+        </w:rPr>
+        <w:br/>
+        <w:t>More generally, forward rates embed expectations plus risk premia.</w:t>
+      </w:r>
+    </w:p>
+    <w:p>
+      <w:pPr>
+        <w:spacing w:after="0"/>
+        <w:rPr>
+          <w:rFonts w:ascii="Calibri" w:hAnsi="Calibri" w:cs="Calibri"/>
+          <w:sz w:val="21"/>
+          <w:szCs w:val="21"/>
+        </w:rPr>
+      </w:pPr>
+    </w:p>
+    <w:p>
+      <w:pPr>
+        <w:spacing w:after="0"/>
+        <w:rPr>
+          <w:rFonts w:ascii="Calibri" w:hAnsi="Calibri" w:cs="Calibri"/>
+          <w:sz w:val="21"/>
+          <w:szCs w:val="21"/>
+        </w:rPr>
+      </w:pPr>
+      <w:r>
+        <w:rPr>
+          <w:rFonts w:ascii="Calibri" w:hAnsi="Calibri" w:cs="Calibri"/>
+          <w:sz w:val="21"/>
+          <w:szCs w:val="21"/>
+        </w:rPr>
+        <w:t>Arbitrage interpretation:</w:t>
+      </w:r>
+      <w:r>
+        <w:rPr>
+          <w:rFonts w:ascii="Calibri" w:hAnsi="Calibri" w:cs="Calibri"/>
+          <w:sz w:val="21"/>
+          <w:szCs w:val="21"/>
+        </w:rPr>
+        <w:br/>
+        <w:t>Investors must be indifferent between investing in a 10-year bond or rolling over shorter maturities. This condition ensures consistency between spot and forward rates.</w:t>
+      </w:r>
+    </w:p>
+    <w:p>
+      <w:pPr>
+        <w:spacing w:after="0"/>
+        <w:rPr>
+          <w:rFonts w:ascii="Calibri" w:hAnsi="Calibri" w:cs="Calibri"/>
+          <w:sz w:val="21"/>
+          <w:szCs w:val="21"/>
+        </w:rPr>
+      </w:pPr>
+    </w:p>
+    <w:p>
+      <w:pPr>
         <w:pStyle w:val="Heading1"/>
         <w:spacing w:before="0"/>
         <w:rPr>
@@ -2161,303 +2453,7 @@
         <w:rPr>
           <w:rFonts w:ascii="Calibri" w:hAnsi="Calibri" w:cs="Calibri"/>
         </w:rPr>
-        <w:t>6</w:t>
-      </w:r>
-      <w:r>
-        <w:rPr>
-          <w:rFonts w:ascii="Calibri" w:hAnsi="Calibri" w:cs="Calibri"/>
-        </w:rPr>
-        <w:t>. Inflation Expectations: 5Y5Y Forward and Breakeven</w:t>
-      </w:r>
-    </w:p>
-    <w:p>
-      <w:pPr>
-        <w:spacing w:after="0"/>
-        <w:rPr>
-          <w:rFonts w:ascii="Calibri" w:hAnsi="Calibri" w:cs="Calibri"/>
-          <w:sz w:val="21"/>
-          <w:szCs w:val="21"/>
-        </w:rPr>
-      </w:pPr>
-      <w:r>
-        <w:rPr>
-          <w:rFonts w:ascii="Calibri" w:hAnsi="Calibri" w:cs="Calibri"/>
-          <w:sz w:val="21"/>
-          <w:szCs w:val="21"/>
-        </w:rPr>
-        <w:t>The project uses market-based inflation expectations derived from financial instruments. Two key measures are considered: the 5-year, 5-year forward inflation rate (5Y5Y)</w:t>
-      </w:r>
-      <w:r>
-        <w:rPr>
-          <w:rFonts w:ascii="Calibri" w:hAnsi="Calibri" w:cs="Calibri"/>
-          <w:sz w:val="21"/>
-          <w:szCs w:val="21"/>
-        </w:rPr>
-        <w:t>,</w:t>
-      </w:r>
-      <w:r>
-        <w:rPr>
-          <w:rFonts w:ascii="Calibri" w:hAnsi="Calibri" w:cs="Calibri"/>
-          <w:sz w:val="21"/>
-          <w:szCs w:val="21"/>
-        </w:rPr>
-        <w:t xml:space="preserve"> and breakeven inflation rates derived from nominal and inflation-indexed bonds.</w:t>
-      </w:r>
-    </w:p>
-    <w:p>
-      <w:pPr>
-        <w:spacing w:after="0"/>
-        <w:rPr>
-          <w:rFonts w:ascii="Calibri" w:hAnsi="Calibri" w:cs="Calibri"/>
-          <w:sz w:val="21"/>
-          <w:szCs w:val="21"/>
-        </w:rPr>
-      </w:pPr>
-    </w:p>
-    <w:p>
-      <w:pPr>
-        <w:spacing w:after="0"/>
-        <w:rPr>
-          <w:rFonts w:ascii="Calibri" w:hAnsi="Calibri" w:cs="Calibri"/>
-          <w:sz w:val="21"/>
-          <w:szCs w:val="21"/>
-        </w:rPr>
-      </w:pPr>
-      <w:r>
-        <w:rPr>
-          <w:rFonts w:ascii="Calibri" w:hAnsi="Calibri" w:cs="Calibri"/>
-          <w:sz w:val="21"/>
-          <w:szCs w:val="21"/>
-        </w:rPr>
-        <w:t>Breakeven inflation (spot):</w:t>
-      </w:r>
-    </w:p>
-    <w:p>
-      <w:pPr>
-        <w:spacing w:after="0"/>
-        <w:rPr>
-          <w:rFonts w:ascii="Calibri" w:hAnsi="Calibri" w:cs="Calibri"/>
-          <w:sz w:val="21"/>
-          <w:szCs w:val="21"/>
-        </w:rPr>
-      </w:pPr>
-      <w:r>
-        <w:rPr>
-          <w:rFonts w:ascii="Calibri" w:hAnsi="Calibri" w:cs="Calibri"/>
-          <w:sz w:val="21"/>
-          <w:szCs w:val="21"/>
-        </w:rPr>
-        <w:t>π_be(t,n) ≈ i_nominal(t,n) − i_real(t,n)</w:t>
-      </w:r>
-      <w:r>
-        <w:rPr>
-          <w:rFonts w:ascii="Calibri" w:hAnsi="Calibri" w:cs="Calibri"/>
-          <w:sz w:val="21"/>
-          <w:szCs w:val="21"/>
-        </w:rPr>
-        <w:br/>
-        <w:t>Example: 10-year breakeven = T10YIE</w:t>
-      </w:r>
-    </w:p>
-    <w:p>
-      <w:pPr>
-        <w:spacing w:after="0"/>
-        <w:rPr>
-          <w:rFonts w:ascii="Calibri" w:hAnsi="Calibri" w:cs="Calibri"/>
-          <w:sz w:val="21"/>
-          <w:szCs w:val="21"/>
-        </w:rPr>
-      </w:pPr>
-    </w:p>
-    <w:p>
-      <w:pPr>
-        <w:spacing w:after="0"/>
-        <w:rPr>
-          <w:rFonts w:ascii="Calibri" w:hAnsi="Calibri" w:cs="Calibri"/>
-          <w:sz w:val="21"/>
-          <w:szCs w:val="21"/>
-        </w:rPr>
-      </w:pPr>
-      <w:r>
-        <w:rPr>
-          <w:rFonts w:ascii="Calibri" w:hAnsi="Calibri" w:cs="Calibri"/>
-          <w:sz w:val="21"/>
-          <w:szCs w:val="21"/>
-        </w:rPr>
-        <w:t>5Y5Y Forward inflation:</w:t>
-      </w:r>
-    </w:p>
-    <w:p>
-      <w:pPr>
-        <w:spacing w:after="0"/>
-        <w:rPr>
-          <w:rFonts w:ascii="Calibri" w:hAnsi="Calibri" w:cs="Calibri"/>
-          <w:sz w:val="21"/>
-          <w:szCs w:val="21"/>
-        </w:rPr>
-      </w:pPr>
-      <w:r>
-        <w:rPr>
-          <w:rFonts w:ascii="Calibri" w:hAnsi="Calibri" w:cs="Calibri"/>
-          <w:sz w:val="21"/>
-          <w:szCs w:val="21"/>
-        </w:rPr>
-        <w:t>The 5Y5Y forward rate reflects expected inflation over a 5-year period starting 5 years ahead.</w:t>
-      </w:r>
-    </w:p>
-    <w:p>
-      <w:pPr>
-        <w:spacing w:after="0"/>
-        <w:rPr>
-          <w:rFonts w:ascii="Calibri" w:hAnsi="Calibri" w:cs="Calibri"/>
-          <w:sz w:val="21"/>
-          <w:szCs w:val="21"/>
-        </w:rPr>
-      </w:pPr>
-      <w:r>
-        <w:rPr>
-          <w:rFonts w:ascii="Calibri" w:hAnsi="Calibri" w:cs="Calibri"/>
-          <w:sz w:val="21"/>
-          <w:szCs w:val="21"/>
-        </w:rPr>
-        <w:br/>
-        <w:t>It is derived from spot rates using no-arbitrage conditions:</w:t>
-      </w:r>
-    </w:p>
-    <w:p>
-      <w:pPr>
-        <w:spacing w:after="0"/>
-        <w:rPr>
-          <w:rFonts w:ascii="Calibri" w:hAnsi="Calibri" w:cs="Calibri"/>
-          <w:sz w:val="21"/>
-          <w:szCs w:val="21"/>
-        </w:rPr>
-      </w:pPr>
-      <w:r>
-        <w:rPr>
-          <w:rFonts w:ascii="Calibri" w:hAnsi="Calibri" w:cs="Calibri"/>
-          <w:sz w:val="21"/>
-          <w:szCs w:val="21"/>
-        </w:rPr>
-        <w:t>(1 + i_10)^10 = (1 + i_5)^5 * (1 + f_5y5y)^5</w:t>
-      </w:r>
-    </w:p>
-    <w:p>
-      <w:pPr>
-        <w:spacing w:after="0"/>
-        <w:rPr>
-          <w:rFonts w:ascii="Calibri" w:hAnsi="Calibri" w:cs="Calibri"/>
-          <w:sz w:val="21"/>
-          <w:szCs w:val="21"/>
-        </w:rPr>
-      </w:pPr>
-    </w:p>
-    <w:p>
-      <w:pPr>
-        <w:spacing w:after="0"/>
-        <w:rPr>
-          <w:rFonts w:ascii="Calibri" w:hAnsi="Calibri" w:cs="Calibri"/>
-          <w:sz w:val="21"/>
-          <w:szCs w:val="21"/>
-        </w:rPr>
-      </w:pPr>
-      <w:r>
-        <w:rPr>
-          <w:rFonts w:ascii="Calibri" w:hAnsi="Calibri" w:cs="Calibri"/>
-          <w:sz w:val="21"/>
-          <w:szCs w:val="21"/>
-        </w:rPr>
-        <w:t>Approximation:</w:t>
-      </w:r>
-      <w:r>
-        <w:rPr>
-          <w:rFonts w:ascii="Calibri" w:hAnsi="Calibri" w:cs="Calibri"/>
-          <w:sz w:val="21"/>
-          <w:szCs w:val="21"/>
-        </w:rPr>
-        <w:br/>
-        <w:t xml:space="preserve"> f_5y5y ≈ 2*i_10 − i_5</w:t>
-      </w:r>
-    </w:p>
-    <w:p>
-      <w:pPr>
-        <w:spacing w:after="0"/>
-        <w:rPr>
-          <w:rFonts w:ascii="Calibri" w:hAnsi="Calibri" w:cs="Calibri"/>
-          <w:sz w:val="21"/>
-          <w:szCs w:val="21"/>
-        </w:rPr>
-      </w:pPr>
-      <w:r>
-        <w:rPr>
-          <w:rFonts w:ascii="Calibri" w:hAnsi="Calibri" w:cs="Calibri"/>
-          <w:sz w:val="21"/>
-          <w:szCs w:val="21"/>
-        </w:rPr>
-        <w:br/>
-        <w:t>More generally, forward rates embed expectations plus risk premia.</w:t>
-      </w:r>
-    </w:p>
-    <w:p>
-      <w:pPr>
-        <w:spacing w:after="0"/>
-        <w:rPr>
-          <w:rFonts w:ascii="Calibri" w:hAnsi="Calibri" w:cs="Calibri"/>
-          <w:sz w:val="21"/>
-          <w:szCs w:val="21"/>
-        </w:rPr>
-      </w:pPr>
-    </w:p>
-    <w:p>
-      <w:pPr>
-        <w:spacing w:after="0"/>
-        <w:rPr>
-          <w:rFonts w:ascii="Calibri" w:hAnsi="Calibri" w:cs="Calibri"/>
-          <w:sz w:val="21"/>
-          <w:szCs w:val="21"/>
-        </w:rPr>
-      </w:pPr>
-      <w:r>
-        <w:rPr>
-          <w:rFonts w:ascii="Calibri" w:hAnsi="Calibri" w:cs="Calibri"/>
-          <w:sz w:val="21"/>
-          <w:szCs w:val="21"/>
-        </w:rPr>
         <w:lastRenderedPageBreak/>
-        <w:t>Arbitrage interpretation:</w:t>
-      </w:r>
-      <w:r>
-        <w:rPr>
-          <w:rFonts w:ascii="Calibri" w:hAnsi="Calibri" w:cs="Calibri"/>
-          <w:sz w:val="21"/>
-          <w:szCs w:val="21"/>
-        </w:rPr>
-        <w:br/>
-        <w:t>Investors must be indifferent between investing in a 10-year bond or rolling over shorter maturities. This condition ensures consistency between spot and forward rates.</w:t>
-      </w:r>
-    </w:p>
-    <w:p>
-      <w:pPr>
-        <w:spacing w:after="0"/>
-        <w:rPr>
-          <w:rFonts w:ascii="Calibri" w:hAnsi="Calibri" w:cs="Calibri"/>
-          <w:sz w:val="21"/>
-          <w:szCs w:val="21"/>
-        </w:rPr>
-      </w:pPr>
-    </w:p>
-    <w:p>
-      <w:pPr>
-        <w:pStyle w:val="Heading1"/>
-        <w:spacing w:before="0"/>
-        <w:rPr>
-          <w:rFonts w:ascii="Calibri" w:hAnsi="Calibri" w:cs="Calibri"/>
-        </w:rPr>
-      </w:pPr>
-      <w:r>
-        <w:rPr>
-          <w:rFonts w:ascii="Calibri" w:hAnsi="Calibri" w:cs="Calibri"/>
-        </w:rPr>
         <w:t>7</w:t>
       </w:r>
       <w:r>

</xml_diff>